<commit_message>
Update System Requirements Specification: Add table of contents and enhance introduction section
</commit_message>
<xml_diff>
--- a/docs/fintracker/Product Requirements Document_FinTracker.docx
+++ b/docs/fintracker/Product Requirements Document_FinTracker.docx
@@ -368,6 +368,8 @@
             </w:tabs>
             <w:rPr>
               <w:rFonts w:eastAsiaTheme="minorEastAsia"/>
+              <w:b/>
+              <w:bCs/>
               <w:noProof/>
               <w:kern w:val="2"/>
               <w:sz w:val="32"/>
@@ -377,6 +379,8 @@
           </w:pPr>
           <w:r>
             <w:rPr>
+              <w:b/>
+              <w:bCs/>
               <w:sz w:val="32"/>
               <w:szCs w:val="32"/>
             </w:rPr>
@@ -384,6 +388,8 @@
           </w:r>
           <w:r>
             <w:rPr>
+              <w:b/>
+              <w:bCs/>
               <w:sz w:val="32"/>
               <w:szCs w:val="32"/>
             </w:rPr>
@@ -391,6 +397,8 @@
           </w:r>
           <w:r>
             <w:rPr>
+              <w:b/>
+              <w:bCs/>
               <w:sz w:val="32"/>
               <w:szCs w:val="32"/>
             </w:rPr>
@@ -400,6 +408,8 @@
             <w:r>
               <w:rPr>
                 <w:rStyle w:val="Hyperlink"/>
+                <w:b/>
+                <w:bCs/>
                 <w:noProof/>
                 <w:color w:val="auto"/>
                 <w:sz w:val="32"/>
@@ -410,6 +420,8 @@
             <w:r>
               <w:rPr>
                 <w:rFonts w:eastAsiaTheme="minorEastAsia"/>
+                <w:b/>
+                <w:bCs/>
                 <w:noProof/>
                 <w:kern w:val="2"/>
                 <w:sz w:val="32"/>
@@ -421,6 +433,8 @@
             <w:r>
               <w:rPr>
                 <w:rStyle w:val="Hyperlink"/>
+                <w:b/>
+                <w:bCs/>
                 <w:noProof/>
                 <w:color w:val="auto"/>
                 <w:sz w:val="32"/>
@@ -431,6 +445,8 @@
             <w:r>
               <w:rPr>
                 <w:rStyle w:val="Hyperlink"/>
+                <w:b/>
+                <w:bCs/>
                 <w:noProof/>
                 <w:color w:val="auto"/>
                 <w:spacing w:val="-6"/>
@@ -442,6 +458,8 @@
             <w:r>
               <w:rPr>
                 <w:rStyle w:val="Hyperlink"/>
+                <w:b/>
+                <w:bCs/>
                 <w:noProof/>
                 <w:color w:val="auto"/>
                 <w:spacing w:val="-2"/>
@@ -452,6 +470,8 @@
             </w:r>
             <w:r>
               <w:rPr>
+                <w:b/>
+                <w:bCs/>
                 <w:noProof/>
                 <w:webHidden/>
                 <w:sz w:val="32"/>
@@ -461,6 +481,8 @@
             </w:r>
             <w:r>
               <w:rPr>
+                <w:b/>
+                <w:bCs/>
                 <w:noProof/>
                 <w:webHidden/>
                 <w:sz w:val="32"/>
@@ -470,6 +492,8 @@
             </w:r>
             <w:r>
               <w:rPr>
+                <w:b/>
+                <w:bCs/>
                 <w:noProof/>
                 <w:webHidden/>
                 <w:sz w:val="32"/>
@@ -479,6 +503,8 @@
             </w:r>
             <w:r>
               <w:rPr>
+                <w:b/>
+                <w:bCs/>
                 <w:noProof/>
                 <w:webHidden/>
                 <w:sz w:val="32"/>
@@ -487,6 +513,8 @@
             </w:r>
             <w:r>
               <w:rPr>
+                <w:b/>
+                <w:bCs/>
                 <w:noProof/>
                 <w:webHidden/>
                 <w:sz w:val="32"/>
@@ -496,6 +524,8 @@
             </w:r>
             <w:r>
               <w:rPr>
+                <w:b/>
+                <w:bCs/>
                 <w:noProof/>
                 <w:webHidden/>
                 <w:sz w:val="32"/>
@@ -505,6 +535,8 @@
             </w:r>
             <w:r>
               <w:rPr>
+                <w:b/>
+                <w:bCs/>
                 <w:noProof/>
                 <w:webHidden/>
                 <w:sz w:val="32"/>
@@ -523,6 +555,8 @@
             </w:tabs>
             <w:rPr>
               <w:rFonts w:eastAsiaTheme="minorEastAsia"/>
+              <w:b/>
+              <w:bCs/>
               <w:noProof/>
               <w:kern w:val="2"/>
               <w:sz w:val="32"/>
@@ -534,6 +568,8 @@
             <w:r>
               <w:rPr>
                 <w:rStyle w:val="Hyperlink"/>
+                <w:b/>
+                <w:bCs/>
                 <w:noProof/>
                 <w:color w:val="auto"/>
                 <w:sz w:val="32"/>
@@ -544,6 +580,8 @@
             <w:r>
               <w:rPr>
                 <w:rFonts w:eastAsiaTheme="minorEastAsia"/>
+                <w:b/>
+                <w:bCs/>
                 <w:noProof/>
                 <w:kern w:val="2"/>
                 <w:sz w:val="32"/>
@@ -555,6 +593,8 @@
             <w:r>
               <w:rPr>
                 <w:rStyle w:val="Hyperlink"/>
+                <w:b/>
+                <w:bCs/>
                 <w:noProof/>
                 <w:color w:val="auto"/>
                 <w:spacing w:val="-8"/>
@@ -566,6 +606,8 @@
             <w:r>
               <w:rPr>
                 <w:rStyle w:val="Hyperlink"/>
+                <w:b/>
+                <w:bCs/>
                 <w:noProof/>
                 <w:color w:val="auto"/>
                 <w:spacing w:val="-17"/>
@@ -577,6 +619,8 @@
             <w:r>
               <w:rPr>
                 <w:rStyle w:val="Hyperlink"/>
+                <w:b/>
+                <w:bCs/>
                 <w:noProof/>
                 <w:color w:val="auto"/>
                 <w:spacing w:val="-2"/>
@@ -587,6 +631,8 @@
             </w:r>
             <w:r>
               <w:rPr>
+                <w:b/>
+                <w:bCs/>
                 <w:noProof/>
                 <w:webHidden/>
                 <w:sz w:val="32"/>
@@ -596,6 +642,8 @@
             </w:r>
             <w:r>
               <w:rPr>
+                <w:b/>
+                <w:bCs/>
                 <w:noProof/>
                 <w:webHidden/>
                 <w:sz w:val="32"/>
@@ -605,6 +653,8 @@
             </w:r>
             <w:r>
               <w:rPr>
+                <w:b/>
+                <w:bCs/>
                 <w:noProof/>
                 <w:webHidden/>
                 <w:sz w:val="32"/>
@@ -614,6 +664,8 @@
             </w:r>
             <w:r>
               <w:rPr>
+                <w:b/>
+                <w:bCs/>
                 <w:noProof/>
                 <w:webHidden/>
                 <w:sz w:val="32"/>
@@ -622,6 +674,8 @@
             </w:r>
             <w:r>
               <w:rPr>
+                <w:b/>
+                <w:bCs/>
                 <w:noProof/>
                 <w:webHidden/>
                 <w:sz w:val="32"/>
@@ -631,6 +685,8 @@
             </w:r>
             <w:r>
               <w:rPr>
+                <w:b/>
+                <w:bCs/>
                 <w:noProof/>
                 <w:webHidden/>
                 <w:sz w:val="32"/>
@@ -640,6 +696,8 @@
             </w:r>
             <w:r>
               <w:rPr>
+                <w:b/>
+                <w:bCs/>
                 <w:noProof/>
                 <w:webHidden/>
                 <w:sz w:val="32"/>
@@ -658,6 +716,8 @@
             </w:tabs>
             <w:rPr>
               <w:rFonts w:eastAsiaTheme="minorEastAsia"/>
+              <w:b/>
+              <w:bCs/>
               <w:noProof/>
               <w:kern w:val="2"/>
               <w:sz w:val="32"/>
@@ -669,6 +729,8 @@
             <w:r>
               <w:rPr>
                 <w:rStyle w:val="Hyperlink"/>
+                <w:b/>
+                <w:bCs/>
                 <w:noProof/>
                 <w:color w:val="auto"/>
                 <w:w w:val="99"/>
@@ -680,6 +742,8 @@
             <w:r>
               <w:rPr>
                 <w:rFonts w:eastAsiaTheme="minorEastAsia"/>
+                <w:b/>
+                <w:bCs/>
                 <w:noProof/>
                 <w:kern w:val="2"/>
                 <w:sz w:val="32"/>
@@ -691,6 +755,8 @@
             <w:r>
               <w:rPr>
                 <w:rStyle w:val="Hyperlink"/>
+                <w:b/>
+                <w:bCs/>
                 <w:noProof/>
                 <w:color w:val="auto"/>
                 <w:spacing w:val="-2"/>
@@ -702,6 +768,8 @@
             <w:r>
               <w:rPr>
                 <w:rStyle w:val="Hyperlink"/>
+                <w:b/>
+                <w:bCs/>
                 <w:noProof/>
                 <w:color w:val="auto"/>
                 <w:spacing w:val="-14"/>
@@ -713,6 +781,8 @@
             <w:r>
               <w:rPr>
                 <w:rStyle w:val="Hyperlink"/>
+                <w:b/>
+                <w:bCs/>
                 <w:noProof/>
                 <w:color w:val="auto"/>
                 <w:spacing w:val="-2"/>
@@ -724,6 +794,8 @@
             <w:r>
               <w:rPr>
                 <w:rStyle w:val="Hyperlink"/>
+                <w:b/>
+                <w:bCs/>
                 <w:noProof/>
                 <w:color w:val="auto"/>
                 <w:spacing w:val="-18"/>
@@ -735,6 +807,8 @@
             <w:r>
               <w:rPr>
                 <w:rStyle w:val="Hyperlink"/>
+                <w:b/>
+                <w:bCs/>
                 <w:noProof/>
                 <w:color w:val="auto"/>
                 <w:spacing w:val="-2"/>
@@ -746,6 +820,8 @@
             <w:r>
               <w:rPr>
                 <w:rStyle w:val="Hyperlink"/>
+                <w:b/>
+                <w:bCs/>
                 <w:noProof/>
                 <w:color w:val="auto"/>
                 <w:spacing w:val="-10"/>
@@ -757,6 +833,8 @@
             <w:r>
               <w:rPr>
                 <w:rStyle w:val="Hyperlink"/>
+                <w:b/>
+                <w:bCs/>
                 <w:noProof/>
                 <w:color w:val="auto"/>
                 <w:spacing w:val="-2"/>
@@ -767,6 +845,8 @@
             </w:r>
             <w:r>
               <w:rPr>
+                <w:b/>
+                <w:bCs/>
                 <w:noProof/>
                 <w:webHidden/>
                 <w:sz w:val="32"/>
@@ -776,6 +856,8 @@
             </w:r>
             <w:r>
               <w:rPr>
+                <w:b/>
+                <w:bCs/>
                 <w:noProof/>
                 <w:webHidden/>
                 <w:sz w:val="32"/>
@@ -785,6 +867,8 @@
             </w:r>
             <w:r>
               <w:rPr>
+                <w:b/>
+                <w:bCs/>
                 <w:noProof/>
                 <w:webHidden/>
                 <w:sz w:val="32"/>
@@ -794,6 +878,8 @@
             </w:r>
             <w:r>
               <w:rPr>
+                <w:b/>
+                <w:bCs/>
                 <w:noProof/>
                 <w:webHidden/>
                 <w:sz w:val="32"/>
@@ -802,6 +888,8 @@
             </w:r>
             <w:r>
               <w:rPr>
+                <w:b/>
+                <w:bCs/>
                 <w:noProof/>
                 <w:webHidden/>
                 <w:sz w:val="32"/>
@@ -811,6 +899,8 @@
             </w:r>
             <w:r>
               <w:rPr>
+                <w:b/>
+                <w:bCs/>
                 <w:noProof/>
                 <w:webHidden/>
                 <w:sz w:val="32"/>
@@ -820,6 +910,8 @@
             </w:r>
             <w:r>
               <w:rPr>
+                <w:b/>
+                <w:bCs/>
                 <w:noProof/>
                 <w:webHidden/>
                 <w:sz w:val="32"/>
@@ -838,6 +930,8 @@
             </w:tabs>
             <w:rPr>
               <w:rFonts w:eastAsiaTheme="minorEastAsia"/>
+              <w:b/>
+              <w:bCs/>
               <w:noProof/>
               <w:kern w:val="2"/>
               <w:sz w:val="32"/>
@@ -849,6 +943,8 @@
             <w:r>
               <w:rPr>
                 <w:rStyle w:val="Hyperlink"/>
+                <w:b/>
+                <w:bCs/>
                 <w:noProof/>
                 <w:color w:val="auto"/>
                 <w:w w:val="99"/>
@@ -860,6 +956,8 @@
             <w:r>
               <w:rPr>
                 <w:rFonts w:eastAsiaTheme="minorEastAsia"/>
+                <w:b/>
+                <w:bCs/>
                 <w:noProof/>
                 <w:kern w:val="2"/>
                 <w:sz w:val="32"/>
@@ -871,6 +969,8 @@
             <w:r>
               <w:rPr>
                 <w:rStyle w:val="Hyperlink"/>
+                <w:b/>
+                <w:bCs/>
                 <w:noProof/>
                 <w:color w:val="auto"/>
                 <w:sz w:val="32"/>
@@ -881,6 +981,8 @@
             <w:r>
               <w:rPr>
                 <w:rStyle w:val="Hyperlink"/>
+                <w:b/>
+                <w:bCs/>
                 <w:noProof/>
                 <w:color w:val="auto"/>
                 <w:spacing w:val="-16"/>
@@ -892,6 +994,8 @@
             <w:r>
               <w:rPr>
                 <w:rStyle w:val="Hyperlink"/>
+                <w:b/>
+                <w:bCs/>
                 <w:noProof/>
                 <w:color w:val="auto"/>
                 <w:sz w:val="32"/>
@@ -902,6 +1006,8 @@
             <w:r>
               <w:rPr>
                 <w:rStyle w:val="Hyperlink"/>
+                <w:b/>
+                <w:bCs/>
                 <w:noProof/>
                 <w:color w:val="auto"/>
                 <w:spacing w:val="-16"/>
@@ -913,6 +1019,8 @@
             <w:r>
               <w:rPr>
                 <w:rStyle w:val="Hyperlink"/>
+                <w:b/>
+                <w:bCs/>
                 <w:noProof/>
                 <w:color w:val="auto"/>
                 <w:spacing w:val="-2"/>
@@ -923,6 +1031,8 @@
             </w:r>
             <w:r>
               <w:rPr>
+                <w:b/>
+                <w:bCs/>
                 <w:noProof/>
                 <w:webHidden/>
                 <w:sz w:val="32"/>
@@ -932,6 +1042,8 @@
             </w:r>
             <w:r>
               <w:rPr>
+                <w:b/>
+                <w:bCs/>
                 <w:noProof/>
                 <w:webHidden/>
                 <w:sz w:val="32"/>
@@ -941,6 +1053,8 @@
             </w:r>
             <w:r>
               <w:rPr>
+                <w:b/>
+                <w:bCs/>
                 <w:noProof/>
                 <w:webHidden/>
                 <w:sz w:val="32"/>
@@ -950,6 +1064,8 @@
             </w:r>
             <w:r>
               <w:rPr>
+                <w:b/>
+                <w:bCs/>
                 <w:noProof/>
                 <w:webHidden/>
                 <w:sz w:val="32"/>
@@ -958,6 +1074,8 @@
             </w:r>
             <w:r>
               <w:rPr>
+                <w:b/>
+                <w:bCs/>
                 <w:noProof/>
                 <w:webHidden/>
                 <w:sz w:val="32"/>
@@ -967,6 +1085,8 @@
             </w:r>
             <w:r>
               <w:rPr>
+                <w:b/>
+                <w:bCs/>
                 <w:noProof/>
                 <w:webHidden/>
                 <w:sz w:val="32"/>
@@ -976,6 +1096,8 @@
             </w:r>
             <w:r>
               <w:rPr>
+                <w:b/>
+                <w:bCs/>
                 <w:noProof/>
                 <w:webHidden/>
                 <w:sz w:val="32"/>
@@ -994,6 +1116,8 @@
             </w:tabs>
             <w:rPr>
               <w:rFonts w:eastAsiaTheme="minorEastAsia"/>
+              <w:b/>
+              <w:bCs/>
               <w:noProof/>
               <w:kern w:val="2"/>
               <w:sz w:val="32"/>
@@ -1005,6 +1129,8 @@
             <w:r>
               <w:rPr>
                 <w:rStyle w:val="Hyperlink"/>
+                <w:b/>
+                <w:bCs/>
                 <w:noProof/>
                 <w:color w:val="auto"/>
                 <w:sz w:val="32"/>
@@ -1015,6 +1141,8 @@
             <w:r>
               <w:rPr>
                 <w:rFonts w:eastAsiaTheme="minorEastAsia"/>
+                <w:b/>
+                <w:bCs/>
                 <w:noProof/>
                 <w:kern w:val="2"/>
                 <w:sz w:val="32"/>
@@ -1026,6 +1154,8 @@
             <w:r>
               <w:rPr>
                 <w:rStyle w:val="Hyperlink"/>
+                <w:b/>
+                <w:bCs/>
                 <w:noProof/>
                 <w:color w:val="auto"/>
                 <w:sz w:val="32"/>
@@ -1036,6 +1166,8 @@
             <w:r>
               <w:rPr>
                 <w:rStyle w:val="Hyperlink"/>
+                <w:b/>
+                <w:bCs/>
                 <w:noProof/>
                 <w:color w:val="auto"/>
                 <w:spacing w:val="-9"/>
@@ -1047,6 +1179,8 @@
             <w:r>
               <w:rPr>
                 <w:rStyle w:val="Hyperlink"/>
+                <w:b/>
+                <w:bCs/>
                 <w:noProof/>
                 <w:color w:val="auto"/>
                 <w:spacing w:val="-2"/>
@@ -1057,6 +1191,8 @@
             </w:r>
             <w:r>
               <w:rPr>
+                <w:b/>
+                <w:bCs/>
                 <w:noProof/>
                 <w:webHidden/>
                 <w:sz w:val="32"/>
@@ -1066,6 +1202,8 @@
             </w:r>
             <w:r>
               <w:rPr>
+                <w:b/>
+                <w:bCs/>
                 <w:noProof/>
                 <w:webHidden/>
                 <w:sz w:val="32"/>
@@ -1075,6 +1213,8 @@
             </w:r>
             <w:r>
               <w:rPr>
+                <w:b/>
+                <w:bCs/>
                 <w:noProof/>
                 <w:webHidden/>
                 <w:sz w:val="32"/>
@@ -1084,6 +1224,8 @@
             </w:r>
             <w:r>
               <w:rPr>
+                <w:b/>
+                <w:bCs/>
                 <w:noProof/>
                 <w:webHidden/>
                 <w:sz w:val="32"/>
@@ -1092,6 +1234,8 @@
             </w:r>
             <w:r>
               <w:rPr>
+                <w:b/>
+                <w:bCs/>
                 <w:noProof/>
                 <w:webHidden/>
                 <w:sz w:val="32"/>
@@ -1101,6 +1245,8 @@
             </w:r>
             <w:r>
               <w:rPr>
+                <w:b/>
+                <w:bCs/>
                 <w:noProof/>
                 <w:webHidden/>
                 <w:sz w:val="32"/>
@@ -1110,6 +1256,8 @@
             </w:r>
             <w:r>
               <w:rPr>
+                <w:b/>
+                <w:bCs/>
                 <w:noProof/>
                 <w:webHidden/>
                 <w:sz w:val="32"/>
@@ -1127,6 +1275,8 @@
             </w:tabs>
             <w:rPr>
               <w:rFonts w:eastAsiaTheme="minorEastAsia"/>
+              <w:b/>
+              <w:bCs/>
               <w:noProof/>
               <w:kern w:val="2"/>
               <w:sz w:val="32"/>
@@ -1138,6 +1288,8 @@
             <w:r>
               <w:rPr>
                 <w:rStyle w:val="Hyperlink"/>
+                <w:b/>
+                <w:bCs/>
                 <w:noProof/>
                 <w:color w:val="auto"/>
                 <w:sz w:val="32"/>
@@ -1148,6 +1300,8 @@
             <w:r>
               <w:rPr>
                 <w:rStyle w:val="Hyperlink"/>
+                <w:b/>
+                <w:bCs/>
                 <w:noProof/>
                 <w:color w:val="auto"/>
                 <w:spacing w:val="-5"/>
@@ -1159,6 +1313,8 @@
             <w:r>
               <w:rPr>
                 <w:rStyle w:val="Hyperlink"/>
+                <w:b/>
+                <w:bCs/>
                 <w:noProof/>
                 <w:color w:val="auto"/>
                 <w:sz w:val="32"/>
@@ -1169,6 +1325,8 @@
             <w:r>
               <w:rPr>
                 <w:rStyle w:val="Hyperlink"/>
+                <w:b/>
+                <w:bCs/>
                 <w:noProof/>
                 <w:color w:val="auto"/>
                 <w:spacing w:val="-3"/>
@@ -1180,6 +1338,8 @@
             <w:r>
               <w:rPr>
                 <w:rStyle w:val="Hyperlink"/>
+                <w:b/>
+                <w:bCs/>
                 <w:noProof/>
                 <w:color w:val="auto"/>
                 <w:sz w:val="32"/>
@@ -1190,6 +1350,8 @@
             <w:r>
               <w:rPr>
                 <w:rStyle w:val="Hyperlink"/>
+                <w:b/>
+                <w:bCs/>
                 <w:noProof/>
                 <w:color w:val="auto"/>
                 <w:spacing w:val="-2"/>
@@ -1201,6 +1363,8 @@
             <w:r>
               <w:rPr>
                 <w:rStyle w:val="Hyperlink"/>
+                <w:b/>
+                <w:bCs/>
                 <w:noProof/>
                 <w:color w:val="auto"/>
                 <w:sz w:val="32"/>
@@ -1211,6 +1375,8 @@
             <w:r>
               <w:rPr>
                 <w:rStyle w:val="Hyperlink"/>
+                <w:b/>
+                <w:bCs/>
                 <w:noProof/>
                 <w:color w:val="auto"/>
                 <w:spacing w:val="-24"/>
@@ -1222,6 +1388,8 @@
             <w:r>
               <w:rPr>
                 <w:rStyle w:val="Hyperlink"/>
+                <w:b/>
+                <w:bCs/>
                 <w:noProof/>
                 <w:color w:val="auto"/>
                 <w:spacing w:val="-2"/>
@@ -1232,6 +1400,8 @@
             </w:r>
             <w:r>
               <w:rPr>
+                <w:b/>
+                <w:bCs/>
                 <w:noProof/>
                 <w:webHidden/>
                 <w:sz w:val="32"/>
@@ -1241,6 +1411,8 @@
             </w:r>
             <w:r>
               <w:rPr>
+                <w:b/>
+                <w:bCs/>
                 <w:noProof/>
                 <w:webHidden/>
                 <w:sz w:val="32"/>
@@ -1250,6 +1422,8 @@
             </w:r>
             <w:r>
               <w:rPr>
+                <w:b/>
+                <w:bCs/>
                 <w:noProof/>
                 <w:webHidden/>
                 <w:sz w:val="32"/>
@@ -1259,6 +1433,8 @@
             </w:r>
             <w:r>
               <w:rPr>
+                <w:b/>
+                <w:bCs/>
                 <w:noProof/>
                 <w:webHidden/>
                 <w:sz w:val="32"/>
@@ -1267,6 +1443,8 @@
             </w:r>
             <w:r>
               <w:rPr>
+                <w:b/>
+                <w:bCs/>
                 <w:noProof/>
                 <w:webHidden/>
                 <w:sz w:val="32"/>
@@ -1276,6 +1454,8 @@
             </w:r>
             <w:r>
               <w:rPr>
+                <w:b/>
+                <w:bCs/>
                 <w:noProof/>
                 <w:webHidden/>
                 <w:sz w:val="32"/>
@@ -1285,6 +1465,8 @@
             </w:r>
             <w:r>
               <w:rPr>
+                <w:b/>
+                <w:bCs/>
                 <w:noProof/>
                 <w:webHidden/>
                 <w:sz w:val="32"/>
@@ -1297,6 +1479,8 @@
         <w:p>
           <w:pPr>
             <w:rPr>
+              <w:b/>
+              <w:bCs/>
               <w:sz w:val="32"/>
               <w:szCs w:val="32"/>
             </w:rPr>
@@ -1458,10 +1642,7 @@
         <w:t xml:space="preserve"> </w:t>
       </w:r>
       <w:r>
-        <w:t xml:space="preserve">application </w:t>
-      </w:r>
-      <w:r>
-        <w:t>designed to help users gain complete control over their cash flow.</w:t>
+        <w:t>application designed to help users gain complete control over their cash flow.</w:t>
       </w:r>
     </w:p>
     <w:p>
@@ -2128,13 +2309,7 @@
           <w:sz w:val="32"/>
         </w:rPr>
         <w:lastRenderedPageBreak/>
-        <w:t xml:space="preserve">Key features </w:t>
-      </w:r>
-      <w:r>
-        <w:rPr>
-          <w:sz w:val="32"/>
-        </w:rPr>
-        <w:t>used: Multiple Book Management (to separate budgeting contexts),</w:t>
+        <w:t>Key features used: Multiple Book Management (to separate budgeting contexts),</w:t>
       </w:r>
       <w:r>
         <w:rPr>
@@ -2918,14 +3093,7 @@
           <w:i/>
           <w:sz w:val="32"/>
         </w:rPr>
-        <w:t xml:space="preserve">System background </w:t>
-      </w:r>
-      <w:r>
-        <w:rPr>
-          <w:i/>
-          <w:sz w:val="32"/>
-        </w:rPr>
-        <w:t>processes.</w:t>
+        <w:t>System background processes.</w:t>
       </w:r>
     </w:p>
     <w:bookmarkEnd w:id="5"/>
@@ -5135,13 +5303,7 @@
               <w:rPr>
                 <w:sz w:val="30"/>
               </w:rPr>
-              <w:t xml:space="preserve">so that I can </w:t>
-            </w:r>
-            <w:r>
-              <w:rPr>
-                <w:sz w:val="30"/>
-              </w:rPr>
-              <w:t>track my</w:t>
+              <w:t>so that I can track my</w:t>
             </w:r>
           </w:p>
           <w:p>
@@ -6805,13 +6967,7 @@
               <w:rPr>
                 <w:sz w:val="30"/>
               </w:rPr>
-              <w:t xml:space="preserve">System updates and </w:t>
-            </w:r>
-            <w:r>
-              <w:rPr>
-                <w:sz w:val="30"/>
-              </w:rPr>
-              <w:t>displays</w:t>
+              <w:t>System updates and displays</w:t>
             </w:r>
             <w:r>
               <w:rPr>
@@ -7628,13 +7784,7 @@
               <w:rPr>
                 <w:sz w:val="30"/>
               </w:rPr>
-              <w:t xml:space="preserve">or completed </w:t>
-            </w:r>
-            <w:r>
-              <w:rPr>
-                <w:sz w:val="30"/>
-              </w:rPr>
-              <w:t>goals.</w:t>
+              <w:t>or completed goals.</w:t>
             </w:r>
           </w:p>
         </w:tc>
@@ -10160,13 +10310,7 @@
               <w:rPr>
                 <w:sz w:val="30"/>
               </w:rPr>
-              <w:t xml:space="preserve">sign in with </w:t>
-            </w:r>
-            <w:r>
-              <w:rPr>
-                <w:sz w:val="30"/>
-              </w:rPr>
-              <w:t>Google so that I can</w:t>
+              <w:t>sign in with Google so that I can</w:t>
             </w:r>
           </w:p>
           <w:p>
@@ -10613,13 +10757,7 @@
               <w:rPr>
                 <w:sz w:val="30"/>
               </w:rPr>
-              <w:t xml:space="preserve">silent login on </w:t>
-            </w:r>
-            <w:r>
-              <w:rPr>
-                <w:sz w:val="30"/>
-              </w:rPr>
-              <w:t>app startup if session exists.</w:t>
+              <w:t>silent login on app startup if session exists.</w:t>
             </w:r>
           </w:p>
         </w:tc>

</xml_diff>